<commit_message>
Complete Devnet verification for Solana weeks 1-8
</commit_message>
<xml_diff>
--- a/docs/Отчёт о выполнении восьми заданий Solana.docx
+++ b/docs/Отчёт о выполнении восьми заданий Solana.docx
@@ -30,7 +30,7 @@
         <w:t xml:space="preserve">В проекте реализованы задания 1–8. </w:t>
       </w:r>
       <w:r>
-        <w:t>Задания 1–3 и 7–8 подтверждены в Solana Devnet. Для заданий 4–6 написаны программа и клиент, но SBF-сборка и развёртывание пока не проводились. Ниже указано подтверждение каждого результата.</w:t>
+        <w:t>Все восемь заданий подтверждены проверками и транзакциями в Solana Devnet. Для заданий 4–6 программа собрана в SBF, развёрнута и вызвана через клиент. Ниже указано подтверждение каждого результата.</w:t>
       </w:r>
     </w:p>
     <w:p>
@@ -121,7 +121,7 @@
         <w:keepLines/>
       </w:pPr>
       <w:r>
-        <w:t>Написана инструкция ping в Anchor; Rust-код проходит cargo check.</w:t>
+        <w:t>Инструкция ping собрана в SBF, программа развёрнута в Devnet, вызов ping подтверждён транзакцией.</w:t>
       </w:r>
       <w:r>
         <w:rPr>
@@ -130,7 +130,7 @@
         <w:t xml:space="preserve"> Подтверждение: </w:t>
       </w:r>
       <w:r>
-        <w:t>learning/anchor/programs/antimatter_learning/src/lib.rs. SBF-бинарник и развёртывание пока отсутствуют.</w:t>
+        <w:t>learning/anchor/programs/antimatter_learning/src/lib.rs; verification/learning-sbf-build.json и learning-program-calls.json.</w:t>
       </w:r>
     </w:p>
     <w:p>
@@ -155,7 +155,7 @@
         <w:t xml:space="preserve"> Подтверждение: </w:t>
       </w:r>
       <w:r>
-        <w:t>Anchor-код, scripts/learning/client.ts и тесты; вызовы в Devnet ожидают развёртывания.</w:t>
+        <w:t>Создание и увеличение подтверждены в Devnet: verification/learning-program-calls.json содержит адрес PDA, подписи и изменение счётчика.</w:t>
       </w:r>
     </w:p>
     <w:p>
@@ -180,7 +180,7 @@
         <w:t xml:space="preserve"> Подтверждение: </w:t>
       </w:r>
       <w:r>
-        <w:t>Anchor-код, src/learning-program.ts и тесты; профиль в Devnet ещё не создан.</w:t>
+        <w:t>Создание и обновление подтверждены в Devnet: verification/learning-program-calls.json содержит адрес PDA, подписи и содержимое профиля.</w:t>
       </w:r>
     </w:p>
     <w:p>
@@ -244,7 +244,7 @@
         <w:t xml:space="preserve">Общая проверка кода: </w:t>
       </w:r>
       <w:r>
-        <w:t>44 теста и веб-сборка прошли. Полное сетевое подтверждение заданий 4–6 требует anchor build, anchor deploy и вызовов клиента на Mac, Linux или WSL.</w:t>
+        <w:t>44 теста и веб-сборка прошли. SBF-сборка в GitHub Actions завершилась успешно; Program ID, SHA-256 бинарника и сетевые вызовы заданий 4–6 проверены отдельно.</w:t>
       </w:r>
     </w:p>
     <w:p>
@@ -452,7 +452,7 @@
         <w:spacing w:before="340"/>
       </w:pPr>
       <w:r>
-        <w:t>Задание 4  Исходник программы</w:t>
+        <w:t>Задание 4  Программа и ping</w:t>
       </w:r>
     </w:p>
     <w:p>
@@ -506,7 +506,7 @@
           <w:color w:val="5F5F5F"/>
           <w:sz w:val="18"/>
         </w:rPr>
-        <w:t>Фрагмент ping, успешный cargo check и текущий статус Program ID в Devnet.</w:t>
+        <w:t>SBF SHA-256, Program ID и подписи транзакций развёртывания и вызова ping.</w:t>
       </w:r>
     </w:p>
     <w:p>
@@ -574,7 +574,7 @@
           <w:color w:val="5F5F5F"/>
           <w:sz w:val="18"/>
         </w:rPr>
-        <w:t>Фрагменты Anchor-кода, вычисленный PDA и результат тестов клиента.</w:t>
+        <w:t>Адрес PDA, подписи создания и увеличения, изменение значения счётчика.</w:t>
       </w:r>
     </w:p>
     <w:p>
@@ -637,7 +637,7 @@
           <w:color w:val="5F5F5F"/>
           <w:sz w:val="18"/>
         </w:rPr>
-        <w:t>Фрагменты Anchor-кода, вычисленный PDA и результат тестов клиента.</w:t>
+        <w:t>Адрес PDA, подписи создания и обновления, сохранённые имя и описание.</w:t>
       </w:r>
     </w:p>
     <w:p>
@@ -782,7 +782,7 @@
         <w:t xml:space="preserve">Источник снимков: </w:t>
       </w:r>
       <w:r>
-        <w:t>публичные отчёты Devnet, исходники проекта и повторно выполненные локальные команды. Снимки 4–6 подтверждают реализацию и тесты, но не заменяют подтверждение развёртывания программы в Devnet. Снимок 8 подтверждает сетевой перевод через код приложения; экранный сценарий двух устройств представлен отдельно в desktop.html.</w:t>
+        <w:t>публичные отчёты Devnet, исходники проекта и повторно выполненные локальные команды. Снимки 4–6 содержат подписи подтверждённых транзакций и состояние PDA. Снимок 8 подтверждает сетевой перевод через код приложения; экранный сценарий двух устройств представлен отдельно в desktop.html.</w:t>
       </w:r>
     </w:p>
     <w:sectPr>

</xml_diff>